<commit_message>
fixed johnson neman plot
</commit_message>
<xml_diff>
--- a/Danny/Psychonomics-Script.docx
+++ b/Danny/Psychonomics-Script.docx
@@ -29,10 +29,7 @@
         <w:t xml:space="preserve">the </w:t>
       </w:r>
       <w:r>
-        <w:t>task and strategic determinants of the irrelevant sound effect. This is joint work with Jamielyn Samper and Jason Chein</w:t>
-      </w:r>
-      <w:r>
-        <w:t xml:space="preserve">. </w:t>
+        <w:t xml:space="preserve">task and strategic determinants of the irrelevant sound effect. This is joint work with Jamie Samper and Jason Chein. </w:t>
       </w:r>
     </w:p>
     <w:p>
@@ -93,10 +90,7 @@
         <w:pStyle w:val="NormalWeb"/>
       </w:pPr>
       <w:r>
-        <w:t>An y why does this disruption appear in some situations but not others</w:t>
-      </w:r>
-      <w:r>
-        <w:t>?</w:t>
+        <w:t>An y why does this disruption appear in some situations but not others?</w:t>
       </w:r>
     </w:p>
     <w:p>
@@ -104,31 +98,7 @@
         <w:pStyle w:val="NormalWeb"/>
       </w:pPr>
       <w:r>
-        <w:t xml:space="preserve">To address this, we systematically varied the features of the </w:t>
-      </w:r>
-      <w:r>
-        <w:t xml:space="preserve">memory </w:t>
-      </w:r>
-      <w:r>
-        <w:t>task</w:t>
-      </w:r>
-      <w:r>
-        <w:t>s,</w:t>
-      </w:r>
-      <w:r>
-        <w:t xml:space="preserve"> the nature of the background sounds, and the strategies people </w:t>
-      </w:r>
-      <w:r>
-        <w:t>used</w:t>
-      </w:r>
-      <w:r>
-        <w:t xml:space="preserve"> during </w:t>
-      </w:r>
-      <w:r>
-        <w:t>these</w:t>
-      </w:r>
-      <w:r>
-        <w:t xml:space="preserve"> tasks.</w:t>
+        <w:t>To address this, we systematically varied the features of the memory tasks, the nature of the background sounds, and the strategies people used during these tasks.</w:t>
       </w:r>
     </w:p>
     <w:p>
@@ -228,28 +198,7 @@
         </w:rPr>
       </w:pPr>
       <w:r>
-        <w:t xml:space="preserve">This </w:t>
-      </w:r>
-      <w:r>
-        <w:t xml:space="preserve">phenomenon </w:t>
-      </w:r>
-      <w:r>
-        <w:t xml:space="preserve">was first demonstrated </w:t>
-      </w:r>
-      <w:r>
-        <w:t xml:space="preserve">using a serial </w:t>
-      </w:r>
-      <w:r>
-        <w:t>memory</w:t>
-      </w:r>
-      <w:r>
-        <w:t xml:space="preserve"> task with visually presented letters.</w:t>
-      </w:r>
-      <w:r>
-        <w:t xml:space="preserve"> </w:t>
-      </w:r>
-      <w:r>
-        <w:t xml:space="preserve">Participants showed significantly worse recall when irrelevant speech was present compared to silence. </w:t>
+        <w:t xml:space="preserve">This phenomenon was first demonstrated using a serial memory task with visually presented letters. Participants showed significantly worse recall when irrelevant speech was present compared to silence. </w:t>
       </w:r>
       <w:r>
         <w:t xml:space="preserve">Since its initial discovery, the ISE has been </w:t>
@@ -325,45 +274,21 @@
         <w:rPr>
           <w:color w:val="EE0000"/>
         </w:rPr>
-        <w:t>→ CLICK</w:t>
-      </w:r>
+        <w:t>→ CLICK 2</w:t>
+      </w:r>
+      <w:proofErr w:type="gramStart"/>
       <w:r>
         <w:rPr>
           <w:color w:val="EE0000"/>
         </w:rPr>
-        <w:t xml:space="preserve"> 2</w:t>
-      </w:r>
-      <w:proofErr w:type="gramStart"/>
+        <w:t>x  (</w:t>
+      </w:r>
+      <w:proofErr w:type="gramEnd"/>
       <w:r>
         <w:rPr>
           <w:color w:val="EE0000"/>
         </w:rPr>
-        <w:t xml:space="preserve">x </w:t>
-      </w:r>
-      <w:r>
-        <w:rPr>
-          <w:color w:val="EE0000"/>
-        </w:rPr>
-        <w:t xml:space="preserve"> (</w:t>
-      </w:r>
-      <w:proofErr w:type="gramEnd"/>
-      <w:r>
-        <w:rPr>
-          <w:color w:val="EE0000"/>
-        </w:rPr>
-        <w:t xml:space="preserve">Because this happens - </w:t>
-      </w:r>
-      <w:r>
-        <w:rPr>
-          <w:color w:val="EE0000"/>
-        </w:rPr>
-        <w:t>baby crying image appears</w:t>
-      </w:r>
-      <w:r>
-        <w:rPr>
-          <w:color w:val="EE0000"/>
-        </w:rPr>
-        <w:t>)</w:t>
+        <w:t>Because this happens - baby crying image appears)</w:t>
       </w:r>
     </w:p>
     <w:p>
@@ -371,55 +296,31 @@
         <w:pStyle w:val="NormalWeb"/>
       </w:pPr>
       <w:r>
-        <w:t>“</w:t>
-      </w:r>
-      <w:r>
-        <w:t>Well</w:t>
+        <w:t>“Well</w:t>
       </w:r>
       <w:proofErr w:type="gramStart"/>
       <w:r>
-        <w:t>….</w:t>
-      </w:r>
-      <w:r>
-        <w:t>Because</w:t>
+        <w:t>….Because</w:t>
       </w:r>
       <w:proofErr w:type="gramEnd"/>
       <w:r>
-        <w:t xml:space="preserve"> this happens.</w:t>
-      </w:r>
-      <w:r>
-        <w:t xml:space="preserve"> </w:t>
-      </w:r>
-      <w:r>
-        <w:t xml:space="preserve">We’re constantly surrounded by sounds we don’t </w:t>
+        <w:t xml:space="preserve"> this happens. We’re constantly surrounded by sounds we don’t </w:t>
       </w:r>
       <w:proofErr w:type="gramStart"/>
       <w:r>
-        <w:t>choose</w:t>
-      </w:r>
-      <w:r>
-        <w:t>:</w:t>
+        <w:t>choose:</w:t>
       </w:r>
       <w:proofErr w:type="gramEnd"/>
       <w:r>
-        <w:t xml:space="preserve"> </w:t>
-      </w:r>
-      <w:r>
-        <w:t xml:space="preserve">crying babies, conversations, street </w:t>
+        <w:t xml:space="preserve"> crying babies, conversations, street </w:t>
       </w:r>
       <w:proofErr w:type="gramStart"/>
       <w:r>
-        <w:t>noise,</w:t>
-      </w:r>
-      <w:r>
-        <w:t>:</w:t>
+        <w:t>noise,:</w:t>
       </w:r>
       <w:proofErr w:type="gramEnd"/>
       <w:r>
-        <w:t xml:space="preserve"> </w:t>
-      </w:r>
-      <w:r>
-        <w:t>sound is basically woven into everyday life.”</w:t>
+        <w:t xml:space="preserve"> sound is basically woven into everyday life.”</w:t>
       </w:r>
     </w:p>
     <w:p>
@@ -472,10 +373,7 @@
         <w:pStyle w:val="NormalWeb"/>
       </w:pPr>
       <w:r>
-        <w:t>It also gives us a really useful window into how working memory is organized.</w:t>
-      </w:r>
-      <w:r>
-        <w:t xml:space="preserve"> </w:t>
+        <w:t xml:space="preserve">It also gives us a really useful window into how working memory is organized. </w:t>
       </w:r>
       <w:proofErr w:type="spellStart"/>
       <w:r>
@@ -571,13 +469,7 @@
         <w:t xml:space="preserve"> </w:t>
       </w:r>
       <w:r>
-        <w:t xml:space="preserve">And here is where decades of research have produced </w:t>
-      </w:r>
-      <w:r>
-        <w:t>divergent</w:t>
-      </w:r>
-      <w:r>
-        <w:t xml:space="preserve"> classes of explanations.</w:t>
+        <w:t>And here is where decades of research have produced divergent classes of explanations.</w:t>
       </w:r>
     </w:p>
     <w:p>
@@ -585,10 +477,7 @@
         <w:pStyle w:val="NormalWeb"/>
       </w:pPr>
       <w:r>
-        <w:t>T</w:t>
-      </w:r>
-      <w:r>
-        <w:t>hough the ISE has been demonstrated in many studies, its presence is far from uniform. Some task contexts reliably produce the effect, while others do not.</w:t>
+        <w:t>Though the ISE has been demonstrated in many studies, its presence is far from uniform. Some task contexts reliably produce the effect, while others do not.</w:t>
       </w:r>
     </w:p>
     <w:p>
@@ -1000,14 +889,7 @@
           <w:rStyle w:val="Strong"/>
           <w:rFonts w:eastAsiaTheme="majorEastAsia"/>
         </w:rPr>
-        <w:t>propose</w:t>
-      </w:r>
-      <w:r>
-        <w:rPr>
-          <w:rStyle w:val="Strong"/>
-          <w:rFonts w:eastAsiaTheme="majorEastAsia"/>
-        </w:rPr>
-        <w:t>s</w:t>
+        <w:t>proposes</w:t>
       </w:r>
       <w:r>
         <w:t xml:space="preserve"> that people maintain order through </w:t>
@@ -1020,22 +902,13 @@
         <w:t>serial rehearsal</w:t>
       </w:r>
       <w:r>
-        <w:t>:</w:t>
-      </w:r>
-      <w:r>
-        <w:t xml:space="preserve"> silently cycling through the items in sequence </w:t>
-      </w:r>
-      <w:r>
-        <w:t xml:space="preserve">– a process that would be disrupted </w:t>
+        <w:t xml:space="preserve">: silently cycling through the items in sequence – a process that would be disrupted </w:t>
       </w:r>
       <w:r>
         <w:t xml:space="preserve">by </w:t>
       </w:r>
       <w:r>
-        <w:t>changing-state distractors</w:t>
-      </w:r>
-      <w:r>
-        <w:t>.</w:t>
+        <w:t>changing-state distractors.</w:t>
       </w:r>
     </w:p>
     <w:p>
@@ -1083,25 +956,7 @@
         <w:pStyle w:val="NormalWeb"/>
       </w:pPr>
       <w:r>
-        <w:t xml:space="preserve">On the attentional-disruption side, we know that unexpected or deviant sounds </w:t>
-      </w:r>
-      <w:r>
-        <w:t>reflexively</w:t>
-      </w:r>
-      <w:r>
-        <w:t xml:space="preserve"> draw attention, and a number of studies show lapses of goal maintenance when background sounds occur. We</w:t>
-      </w:r>
-      <w:r>
-        <w:t xml:space="preserve">’ve also </w:t>
-      </w:r>
-      <w:r>
-        <w:t>see</w:t>
-      </w:r>
-      <w:r>
-        <w:t>n</w:t>
-      </w:r>
-      <w:r>
-        <w:t xml:space="preserve"> ISE-type disruption in tasks that don’t strongly emphasize serial order, and in tasks designed to make serial rehearsal impossible. Those findings </w:t>
+        <w:t xml:space="preserve">On the attentional-disruption side, we know that unexpected or deviant sounds reflexively draw attention, and a number of studies show lapses of goal maintenance when background sounds occur. We’ve also seen ISE-type disruption in tasks that don’t strongly emphasize serial order, and in tasks designed to make serial rehearsal impossible. Those findings </w:t>
       </w:r>
       <w:r>
         <w:t>casts doubt on order interference and suggest</w:t>
@@ -1144,13 +999,7 @@
         <w:pStyle w:val="NormalWeb"/>
       </w:pPr>
       <w:r>
-        <w:t xml:space="preserve">On the order-interference side, </w:t>
-      </w:r>
-      <w:r>
-        <w:t>ISE is consistently</w:t>
-      </w:r>
-      <w:r>
-        <w:t xml:space="preserve"> largest in traditional serial-recall tasks and becomes much smaller when tasks reduce or remove ordered-maintenance demands. We also see the well-established changing-state effect, where varied sound sequences</w:t>
+        <w:t>On the order-interference side, ISE is consistently largest in traditional serial-recall tasks and becomes much smaller when tasks reduce or remove ordered-maintenance demands. We also see the well-established changing-state effect, where varied sound sequences</w:t>
       </w:r>
       <w:r>
         <w:t xml:space="preserve"> – which would disrupt auditory seriation </w:t>
@@ -1230,10 +1079,7 @@
       </w:pPr>
       <w:r>
         <w:br/>
-        <w:t>The</w:t>
-      </w:r>
-      <w:r>
-        <w:t xml:space="preserve"> duplex-mechanism accounts, which propose that irrelevant sounds can disrupt working memory through two separable pathways.</w:t>
+        <w:t>The duplex-mechanism accounts, which propose that irrelevant sounds can disrupt working memory through two separable pathways.</w:t>
       </w:r>
       <w:r>
         <w:br/>
@@ -1269,9 +1115,168 @@
       <w:pPr>
         <w:pStyle w:val="NormalWeb"/>
         <w:rPr>
+          <w:b/>
+          <w:bCs/>
           <w:color w:val="124F1A" w:themeColor="accent3" w:themeShade="BF"/>
-        </w:rPr>
-      </w:pPr>
+          <w:u w:val="single"/>
+        </w:rPr>
+      </w:pPr>
+      <w:r>
+        <w:rPr>
+          <w:b/>
+          <w:bCs/>
+          <w:color w:val="124F1A" w:themeColor="accent3" w:themeShade="BF"/>
+          <w:u w:val="single"/>
+        </w:rPr>
+        <w:t xml:space="preserve">Notes: </w:t>
+      </w:r>
+    </w:p>
+    <w:p>
+      <w:pPr>
+        <w:pStyle w:val="NormalWeb"/>
+        <w:rPr>
+          <w:color w:val="124F1A" w:themeColor="accent3" w:themeShade="BF"/>
+        </w:rPr>
+      </w:pPr>
+      <w:r>
+        <w:rPr>
+          <w:color w:val="124F1A" w:themeColor="accent3" w:themeShade="BF"/>
+        </w:rPr>
+        <w:t xml:space="preserve">Examples: </w:t>
+      </w:r>
+      <w:r>
+        <w:rPr>
+          <w:color w:val="124F1A" w:themeColor="accent3" w:themeShade="BF"/>
+        </w:rPr>
+        <w:br/>
+      </w:r>
+    </w:p>
+    <w:p>
+      <w:pPr>
+        <w:pStyle w:val="NormalWeb"/>
+        <w:rPr>
+          <w:color w:val="124F1A" w:themeColor="accent3" w:themeShade="BF"/>
+        </w:rPr>
+      </w:pPr>
+      <w:r>
+        <w:rPr>
+          <w:color w:val="124F1A" w:themeColor="accent3" w:themeShade="BF"/>
+        </w:rPr>
+        <w:t xml:space="preserve">First and </w:t>
+      </w:r>
+      <w:proofErr w:type="spellStart"/>
+      <w:r>
+        <w:rPr>
+          <w:color w:val="124F1A" w:themeColor="accent3" w:themeShade="BF"/>
+        </w:rPr>
+        <w:t>TYPICALLY.subqueunatly</w:t>
+      </w:r>
+      <w:proofErr w:type="spellEnd"/>
+      <w:r>
+        <w:rPr>
+          <w:color w:val="124F1A" w:themeColor="accent3" w:themeShade="BF"/>
+        </w:rPr>
+        <w:t xml:space="preserve"> demonstrated in serial </w:t>
+      </w:r>
+      <w:proofErr w:type="spellStart"/>
+      <w:r>
+        <w:rPr>
+          <w:color w:val="124F1A" w:themeColor="accent3" w:themeShade="BF"/>
+        </w:rPr>
+        <w:t>paradigmns</w:t>
+      </w:r>
+      <w:proofErr w:type="spellEnd"/>
+      <w:r>
+        <w:rPr>
+          <w:color w:val="124F1A" w:themeColor="accent3" w:themeShade="BF"/>
+        </w:rPr>
+        <w:t xml:space="preserve"> - </w:t>
+      </w:r>
+      <w:r>
+        <w:rPr>
+          <w:color w:val="124F1A" w:themeColor="accent3" w:themeShade="BF"/>
+        </w:rPr>
+        <w:br/>
+        <w:t>so the basic experimental manipulation</w:t>
+      </w:r>
+      <w:proofErr w:type="gramStart"/>
+      <w:r>
+        <w:rPr>
+          <w:color w:val="124F1A" w:themeColor="accent3" w:themeShade="BF"/>
+        </w:rPr>
+        <w:t>….describes</w:t>
+      </w:r>
+      <w:proofErr w:type="gramEnd"/>
+      <w:r>
+        <w:rPr>
+          <w:color w:val="124F1A" w:themeColor="accent3" w:themeShade="BF"/>
+        </w:rPr>
+        <w:t>….</w:t>
+      </w:r>
+      <w:r>
+        <w:rPr>
+          <w:color w:val="124F1A" w:themeColor="accent3" w:themeShade="BF"/>
+        </w:rPr>
+        <w:br/>
+      </w:r>
+      <w:r>
+        <w:rPr>
+          <w:color w:val="124F1A" w:themeColor="accent3" w:themeShade="BF"/>
+        </w:rPr>
+        <w:br/>
+        <w:t>and 3</w:t>
+      </w:r>
+      <w:r>
+        <w:rPr>
+          <w:color w:val="124F1A" w:themeColor="accent3" w:themeShade="BF"/>
+          <w:vertAlign w:val="superscript"/>
+        </w:rPr>
+        <w:t>rd</w:t>
+      </w:r>
+      <w:r>
+        <w:rPr>
+          <w:color w:val="124F1A" w:themeColor="accent3" w:themeShade="BF"/>
+        </w:rPr>
+        <w:t xml:space="preserve"> point remove it by carefully almost saying the opposite……</w:t>
+      </w:r>
+    </w:p>
+    <w:p>
+      <w:pPr>
+        <w:pStyle w:val="NormalWeb"/>
+        <w:rPr>
+          <w:color w:val="124F1A" w:themeColor="accent3" w:themeShade="BF"/>
+        </w:rPr>
+      </w:pPr>
+      <w:r>
+        <w:rPr>
+          <w:color w:val="124F1A" w:themeColor="accent3" w:themeShade="BF"/>
+        </w:rPr>
+        <w:t>Frameworks – occasionally……</w:t>
+      </w:r>
+    </w:p>
+    <w:p>
+      <w:pPr>
+        <w:pStyle w:val="NormalWeb"/>
+        <w:rPr>
+          <w:color w:val="124F1A" w:themeColor="accent3" w:themeShade="BF"/>
+        </w:rPr>
+      </w:pPr>
+    </w:p>
+    <w:p>
+      <w:pPr>
+        <w:pStyle w:val="NormalWeb"/>
+        <w:rPr>
+          <w:color w:val="124F1A" w:themeColor="accent3" w:themeShade="BF"/>
+        </w:rPr>
+      </w:pPr>
+      <w:r>
+        <w:rPr>
+          <w:i/>
+          <w:iCs/>
+          <w:color w:val="124F1A" w:themeColor="accent3" w:themeShade="BF"/>
+        </w:rPr>
+        <w:t>Remove phonological-content interference….</w:t>
+      </w:r>
     </w:p>
     <w:sectPr>
       <w:pgSz w:w="12240" w:h="15840"/>

</xml_diff>